<commit_message>
Add a file in LR1
</commit_message>
<xml_diff>
--- a/IGI/LR1/Report1.docx
+++ b/IGI/LR1/Report1.docx
@@ -821,7 +821,7 @@
           <w:szCs w:val="32"/>
         </w:rPr>
         <w:lastRenderedPageBreak/>
-        <w:t>1</w:t>
+        <w:t xml:space="preserve">ХОД </w:t>
       </w:r>
       <w:r>
         <w:rPr>
@@ -830,7 +830,7 @@
           <w:sz w:val="32"/>
           <w:szCs w:val="32"/>
         </w:rPr>
-        <w:t xml:space="preserve"> ИНДИВИДУАЛЬНОЕ</w:t>
+        <w:t>ВЫПОЛНЕНИ</w:t>
       </w:r>
       <w:r>
         <w:rPr>
@@ -839,7 +839,7 @@
           <w:sz w:val="32"/>
           <w:szCs w:val="32"/>
         </w:rPr>
-        <w:t xml:space="preserve"> ЗАДАНИЕ</w:t>
+        <w:t>Я</w:t>
       </w:r>
       <w:r>
         <w:rPr>
@@ -848,192 +848,6 @@
           <w:sz w:val="32"/>
           <w:szCs w:val="32"/>
         </w:rPr>
-        <w:tab/>
-      </w:r>
-    </w:p>
-    <w:p>
-      <w:pPr>
-        <w:pStyle w:val="Stand"/>
-        <w:ind w:firstLine="0"/>
-        <w:rPr>
-          <w:b/>
-          <w:bCs/>
-          <w:sz w:val="32"/>
-          <w:szCs w:val="32"/>
-        </w:rPr>
-      </w:pPr>
-    </w:p>
-    <w:p>
-      <w:pPr>
-        <w:pStyle w:val="Stand"/>
-      </w:pPr>
-      <w:r>
-        <w:rPr>
-          <w:b/>
-          <w:bCs/>
-        </w:rPr>
-        <w:t xml:space="preserve">Вариант </w:t>
-      </w:r>
-      <w:r>
-        <w:rPr>
-          <w:b/>
-          <w:bCs/>
-        </w:rPr>
-        <w:t>4</w:t>
-      </w:r>
-      <w:r>
-        <w:rPr>
-          <w:b/>
-          <w:bCs/>
-        </w:rPr>
-        <w:t>.</w:t>
-      </w:r>
-      <w:r>
-        <w:t xml:space="preserve"> </w:t>
-      </w:r>
-      <w:r>
-        <w:t>Написать программу, запускающую другую программу N раз (N – число в диапазоне [1, 255]). Имя запускаемой программы задается в текстовом файле в K строке (K – число в диапазоне [1, 255]).</w:t>
-      </w:r>
-    </w:p>
-    <w:p>
-      <w:pPr>
-        <w:pStyle w:val="Stand"/>
-      </w:pPr>
-      <w:r>
-        <w:rPr>
-          <w:b/>
-          <w:bCs/>
-          <w:noProof/>
-          <w:sz w:val="32"/>
-          <w:szCs w:val="32"/>
-        </w:rPr>
-        <mc:AlternateContent>
-          <mc:Choice Requires="wps">
-            <w:drawing>
-              <wp:anchor distT="0" distB="0" distL="114300" distR="114300" simplePos="0" relativeHeight="251662336" behindDoc="0" locked="0" layoutInCell="1" allowOverlap="1" wp14:anchorId="443E6226" wp14:editId="2BB2A4FA">
-                <wp:simplePos x="0" y="0"/>
-                <wp:positionH relativeFrom="column">
-                  <wp:posOffset>5724525</wp:posOffset>
-                </wp:positionH>
-                <wp:positionV relativeFrom="paragraph">
-                  <wp:posOffset>142875</wp:posOffset>
-                </wp:positionV>
-                <wp:extent cx="327660" cy="426720"/>
-                <wp:effectExtent l="0" t="0" r="15240" b="11430"/>
-                <wp:wrapNone/>
-                <wp:docPr id="4" name="Прямоугольник 4"/>
-                <wp:cNvGraphicFramePr/>
-                <a:graphic xmlns:a="http://schemas.openxmlformats.org/drawingml/2006/main">
-                  <a:graphicData uri="http://schemas.microsoft.com/office/word/2010/wordprocessingShape">
-                    <wps:wsp>
-                      <wps:cNvSpPr/>
-                      <wps:spPr>
-                        <a:xfrm>
-                          <a:off x="0" y="0"/>
-                          <a:ext cx="327660" cy="426720"/>
-                        </a:xfrm>
-                        <a:prstGeom prst="rect">
-                          <a:avLst/>
-                        </a:prstGeom>
-                        <a:solidFill>
-                          <a:schemeClr val="bg1"/>
-                        </a:solidFill>
-                        <a:ln>
-                          <a:solidFill>
-                            <a:schemeClr val="bg1"/>
-                          </a:solidFill>
-                        </a:ln>
-                      </wps:spPr>
-                      <wps:style>
-                        <a:lnRef idx="2">
-                          <a:schemeClr val="accent1">
-                            <a:shade val="50000"/>
-                          </a:schemeClr>
-                        </a:lnRef>
-                        <a:fillRef idx="1">
-                          <a:schemeClr val="accent1"/>
-                        </a:fillRef>
-                        <a:effectRef idx="0">
-                          <a:schemeClr val="accent1"/>
-                        </a:effectRef>
-                        <a:fontRef idx="minor">
-                          <a:schemeClr val="lt1"/>
-                        </a:fontRef>
-                      </wps:style>
-                      <wps:bodyPr rot="0" spcFirstLastPara="0" vertOverflow="overflow" horzOverflow="overflow" vert="horz" wrap="square" lIns="91440" tIns="45720" rIns="91440" bIns="45720" numCol="1" spcCol="0" rtlCol="0" fromWordArt="0" anchor="ctr" anchorCtr="0" forceAA="0" compatLnSpc="1">
-                        <a:prstTxWarp prst="textNoShape">
-                          <a:avLst/>
-                        </a:prstTxWarp>
-                        <a:noAutofit/>
-                      </wps:bodyPr>
-                    </wps:wsp>
-                  </a:graphicData>
-                </a:graphic>
-              </wp:anchor>
-            </w:drawing>
-          </mc:Choice>
-          <mc:Fallback>
-            <w:pict>
-              <v:rect w14:anchorId="16293365" id="Прямоугольник 4" o:spid="_x0000_s1026" style="position:absolute;margin-left:450.75pt;margin-top:11.25pt;width:25.8pt;height:33.6pt;z-index:251662336;visibility:visible;mso-wrap-style:square;mso-wrap-distance-left:9pt;mso-wrap-distance-top:0;mso-wrap-distance-right:9pt;mso-wrap-distance-bottom:0;mso-position-horizontal:absolute;mso-position-horizontal-relative:text;mso-position-vertical:absolute;mso-position-vertical-relative:text;v-text-anchor:middle" o:gfxdata="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" fillcolor="white [3212]" strokecolor="white [3212]" strokeweight="1pt"/>
-            </w:pict>
-          </mc:Fallback>
-        </mc:AlternateContent>
-      </w:r>
-    </w:p>
-    <w:p>
-      <w:pPr>
-        <w:pStyle w:val="Stand"/>
-        <w:ind w:firstLine="0"/>
-        <w:rPr>
-          <w:b/>
-          <w:bCs/>
-          <w:sz w:val="32"/>
-          <w:szCs w:val="32"/>
-        </w:rPr>
-      </w:pPr>
-      <w:r>
-        <w:rPr>
-          <w:b/>
-          <w:bCs/>
-          <w:sz w:val="32"/>
-          <w:szCs w:val="32"/>
-        </w:rPr>
-        <w:t xml:space="preserve">2 </w:t>
-      </w:r>
-      <w:r>
-        <w:rPr>
-          <w:b/>
-          <w:bCs/>
-          <w:sz w:val="32"/>
-          <w:szCs w:val="32"/>
-        </w:rPr>
-        <w:t xml:space="preserve">ХОД </w:t>
-      </w:r>
-      <w:r>
-        <w:rPr>
-          <w:b/>
-          <w:bCs/>
-          <w:sz w:val="32"/>
-          <w:szCs w:val="32"/>
-        </w:rPr>
-        <w:t>ВЫПОЛНЕНИ</w:t>
-      </w:r>
-      <w:r>
-        <w:rPr>
-          <w:b/>
-          <w:bCs/>
-          <w:sz w:val="32"/>
-          <w:szCs w:val="32"/>
-        </w:rPr>
-        <w:t>Я</w:t>
-      </w:r>
-      <w:r>
-        <w:rPr>
-          <w:b/>
-          <w:bCs/>
-          <w:sz w:val="32"/>
-          <w:szCs w:val="32"/>
-        </w:rPr>
         <w:t xml:space="preserve"> РАБОТЫ</w:t>
       </w:r>
     </w:p>
@@ -1045,180 +859,102 @@
     <w:p>
       <w:pPr>
         <w:pStyle w:val="Stand"/>
-      </w:pPr>
-      <w:r>
-        <w:t>Для выполнения лабораторной работы используется програм</w:t>
-      </w:r>
-      <w:r>
-        <w:t>м</w:t>
-      </w:r>
-      <w:r>
-        <w:t xml:space="preserve">ы </w:t>
-      </w:r>
-      <w:r>
+        <w:jc w:val="center"/>
+        <w:rPr>
+          <w:lang w:val="ru-BY"/>
+        </w:rPr>
+      </w:pPr>
+      <w:r>
+        <w:rPr>
+          <w:lang w:val="ru-BY"/>
+        </w:rPr>
+        <w:drawing>
+          <wp:inline distT="0" distB="0" distL="0" distR="0" wp14:anchorId="5ABBB99E" wp14:editId="1A0FC31F">
+            <wp:extent cx="3505557" cy="4099560"/>
+            <wp:effectExtent l="0" t="0" r="0" b="0"/>
+            <wp:docPr id="5" name="Рисунок 5"/>
+            <wp:cNvGraphicFramePr>
+              <a:graphicFrameLocks xmlns:a="http://schemas.openxmlformats.org/drawingml/2006/main" noChangeAspect="1"/>
+            </wp:cNvGraphicFramePr>
+            <a:graphic xmlns:a="http://schemas.openxmlformats.org/drawingml/2006/main">
+              <a:graphicData uri="http://schemas.openxmlformats.org/drawingml/2006/picture">
+                <pic:pic xmlns:pic="http://schemas.openxmlformats.org/drawingml/2006/picture">
+                  <pic:nvPicPr>
+                    <pic:cNvPr id="0" name="Picture 6"/>
+                    <pic:cNvPicPr>
+                      <a:picLocks noChangeAspect="1" noChangeArrowheads="1"/>
+                    </pic:cNvPicPr>
+                  </pic:nvPicPr>
+                  <pic:blipFill>
+                    <a:blip r:embed="rId8">
+                      <a:extLst>
+                        <a:ext uri="{28A0092B-C50C-407E-A947-70E740481C1C}">
+                          <a14:useLocalDpi xmlns:a14="http://schemas.microsoft.com/office/drawing/2010/main" val="0"/>
+                        </a:ext>
+                      </a:extLst>
+                    </a:blip>
+                    <a:srcRect/>
+                    <a:stretch>
+                      <a:fillRect/>
+                    </a:stretch>
+                  </pic:blipFill>
+                  <pic:spPr bwMode="auto">
+                    <a:xfrm>
+                      <a:off x="0" y="0"/>
+                      <a:ext cx="3512756" cy="4107979"/>
+                    </a:xfrm>
+                    <a:prstGeom prst="rect">
+                      <a:avLst/>
+                    </a:prstGeom>
+                    <a:noFill/>
+                    <a:ln>
+                      <a:noFill/>
+                    </a:ln>
+                  </pic:spPr>
+                </pic:pic>
+              </a:graphicData>
+            </a:graphic>
+          </wp:inline>
+        </w:drawing>
+      </w:r>
+    </w:p>
+    <w:p>
+      <w:pPr>
+        <w:pStyle w:val="Stand"/>
+      </w:pPr>
+    </w:p>
+    <w:p>
+      <w:pPr>
+        <w:pStyle w:val="Stand"/>
+        <w:jc w:val="center"/>
+      </w:pPr>
+      <w:r>
+        <w:t>Рисунок 1 –</w:t>
+      </w:r>
+      <w:r>
+        <w:t xml:space="preserve"> Создание репозитория</w:t>
+      </w:r>
+    </w:p>
+    <w:p>
+      <w:pPr>
+        <w:pStyle w:val="Stand"/>
+      </w:pPr>
+    </w:p>
+    <w:p>
+      <w:pPr>
+        <w:pStyle w:val="Stand"/>
+        <w:jc w:val="center"/>
         <w:rPr>
           <w:lang w:val="en-US"/>
         </w:rPr>
-        <w:t>emu</w:t>
-      </w:r>
-      <w:r>
-        <w:t xml:space="preserve">8086 </w:t>
-      </w:r>
-      <w:r>
-        <w:t>с целью</w:t>
-      </w:r>
-      <w:r>
-        <w:t xml:space="preserve"> симул</w:t>
-      </w:r>
-      <w:r>
-        <w:t>яции</w:t>
-      </w:r>
-      <w:r>
-        <w:t xml:space="preserve"> работ</w:t>
-      </w:r>
-      <w:r>
-        <w:t>ы</w:t>
-      </w:r>
-      <w:r>
-        <w:t xml:space="preserve"> ассемблера </w:t>
-      </w:r>
-      <w:r>
-        <w:t>процессора</w:t>
-      </w:r>
-      <w:r>
-        <w:t xml:space="preserve"> </w:t>
-      </w:r>
+      </w:pPr>
       <w:r>
         <w:rPr>
           <w:lang w:val="en-US"/>
         </w:rPr>
-        <w:t>Intel</w:t>
-      </w:r>
-      <w:r>
-        <w:t xml:space="preserve"> 8086</w:t>
-      </w:r>
-      <w:r>
-        <w:t>.</w:t>
-      </w:r>
-      <w:r>
-        <w:t xml:space="preserve"> </w:t>
-      </w:r>
-      <w:r>
-        <w:t>В ходе выполнения работы был создан файл</w:t>
-      </w:r>
-      <w:r>
-        <w:t xml:space="preserve"> </w:t>
-      </w:r>
-      <w:r>
-        <w:rPr>
-          <w:lang w:val="en-US"/>
-        </w:rPr>
-        <w:t>Task</w:t>
-      </w:r>
-      <w:r>
-        <w:t>.</w:t>
-      </w:r>
-    </w:p>
-    <w:p>
-      <w:pPr>
-        <w:pStyle w:val="Stand"/>
-      </w:pPr>
-      <w:r>
-        <w:t xml:space="preserve">В файле </w:t>
-      </w:r>
-      <w:r>
-        <w:rPr>
-          <w:lang w:val="en-US"/>
-        </w:rPr>
-        <w:t>Task</w:t>
-      </w:r>
-      <w:r>
-        <w:t xml:space="preserve"> </w:t>
-      </w:r>
-      <w:r>
-        <w:t>был</w:t>
-      </w:r>
-      <w:r>
-        <w:t>и созданы процедуры для считывания имени файла, содержащего имя вызываемой программы в некоторой строке, для чтения этого файла и возврата имени вызываемой программы из строки, для вызова другой программы</w:t>
-      </w:r>
-      <w:r>
-        <w:t xml:space="preserve">. </w:t>
-      </w:r>
-      <w:r>
-        <w:t xml:space="preserve">Путь к файлу со строками задается из командной строки. Перед вызовом процедур с помощью прерывания </w:t>
-      </w:r>
-      <w:r>
-        <w:t>4</w:t>
-      </w:r>
-      <w:r>
-        <w:rPr>
-          <w:lang w:val="en-US"/>
-        </w:rPr>
-        <w:t>ah</w:t>
-      </w:r>
-      <w:r>
-        <w:t xml:space="preserve"> </w:t>
-      </w:r>
-      <w:r>
-        <w:t xml:space="preserve">изменяется размер программы. Новый размер высчитывается как сумма длин области </w:t>
-      </w:r>
-      <w:r>
-        <w:rPr>
-          <w:lang w:val="en-US"/>
-        </w:rPr>
-        <w:t>PSP</w:t>
-      </w:r>
-      <w:r>
-        <w:t xml:space="preserve">, сегмента стека, сегмента кода и сегмента данных. Перед вызовом процедуры выполнения другой программы заполняется блок </w:t>
-      </w:r>
-      <w:r>
-        <w:rPr>
-          <w:lang w:val="en-US"/>
-        </w:rPr>
-        <w:t>EPB</w:t>
-      </w:r>
-      <w:r>
-        <w:t xml:space="preserve">. </w:t>
-      </w:r>
-      <w:r>
-        <w:t xml:space="preserve">Вызываемая программа выводит текст в консоль для проверки того, что она отработала. </w:t>
-      </w:r>
-      <w:r>
-        <w:t xml:space="preserve"> </w:t>
-      </w:r>
-      <w:r>
-        <w:t xml:space="preserve">Для выполнения программы используется эмулятор </w:t>
-      </w:r>
-      <w:r>
-        <w:rPr>
-          <w:lang w:val="en-US"/>
-        </w:rPr>
-        <w:t>DOSBox</w:t>
-      </w:r>
-      <w:r>
-        <w:t>.</w:t>
-      </w:r>
-      <w:r>
-        <w:t xml:space="preserve"> </w:t>
-      </w:r>
-    </w:p>
-    <w:p>
-      <w:pPr>
-        <w:pStyle w:val="Stand"/>
-      </w:pPr>
-    </w:p>
-    <w:p>
-      <w:pPr>
-        <w:pStyle w:val="Stand"/>
-        <w:jc w:val="center"/>
-      </w:pPr>
-      <w:r>
-        <w:rPr>
-          <w:noProof/>
-        </w:rPr>
         <w:drawing>
-          <wp:inline distT="0" distB="0" distL="0" distR="0" wp14:anchorId="74DD2F73" wp14:editId="5BAD703A">
-            <wp:extent cx="2959215" cy="3291840"/>
+          <wp:inline distT="0" distB="0" distL="0" distR="0" wp14:anchorId="6DF6D241" wp14:editId="430D31F7">
+            <wp:extent cx="3949898" cy="167640"/>
             <wp:effectExtent l="0" t="0" r="0" b="3810"/>
             <wp:docPr id="1" name="Рисунок 1"/>
             <wp:cNvGraphicFramePr>
@@ -1232,7 +968,7 @@
                     <pic:cNvPicPr/>
                   </pic:nvPicPr>
                   <pic:blipFill>
-                    <a:blip r:embed="rId8"/>
+                    <a:blip r:embed="rId9"/>
                     <a:stretch>
                       <a:fillRect/>
                     </a:stretch>
@@ -1240,7 +976,7 @@
                   <pic:spPr>
                     <a:xfrm>
                       <a:off x="0" y="0"/>
-                      <a:ext cx="2968368" cy="3302022"/>
+                      <a:ext cx="4493346" cy="190705"/>
                     </a:xfrm>
                     <a:prstGeom prst="rect">
                       <a:avLst/>
@@ -1256,6 +992,9 @@
     <w:p>
       <w:pPr>
         <w:pStyle w:val="Stand"/>
+        <w:rPr>
+          <w:lang w:val="en-US"/>
+        </w:rPr>
       </w:pPr>
     </w:p>
     <w:p>
@@ -1264,115 +1003,90 @@
         <w:jc w:val="center"/>
       </w:pPr>
       <w:r>
-        <w:rPr>
-          <w:noProof/>
-        </w:rPr>
-        <w:t xml:space="preserve">Рисунок 1 – Результат работы программы </w:t>
-      </w:r>
-      <w:r>
-        <w:rPr>
-          <w:noProof/>
+        <w:t>Рисунок 2 –</w:t>
+      </w:r>
+      <w:r>
+        <w:t xml:space="preserve"> Индексация файла</w:t>
+      </w:r>
+    </w:p>
+    <w:p>
+      <w:pPr>
+        <w:pStyle w:val="Stand"/>
+      </w:pPr>
+    </w:p>
+    <w:p>
+      <w:pPr>
+        <w:pStyle w:val="Stand"/>
+        <w:jc w:val="center"/>
+        <w:rPr>
           <w:lang w:val="en-US"/>
         </w:rPr>
-        <w:t>Task</w:t>
-      </w:r>
-    </w:p>
-    <w:p>
-      <w:pPr>
-        <w:pStyle w:val="Stand"/>
-        <w:ind w:firstLine="0"/>
-      </w:pPr>
-      <w:r>
-        <w:br w:type="page"/>
-      </w:r>
-    </w:p>
-    <w:p>
-      <w:pPr>
-        <w:pStyle w:val="Stand"/>
-        <w:ind w:firstLine="0"/>
+      </w:pPr>
+      <w:r>
+        <w:rPr>
+          <w:lang w:val="en-US"/>
+        </w:rPr>
+        <w:drawing>
+          <wp:inline distT="0" distB="0" distL="0" distR="0" wp14:anchorId="7678843B" wp14:editId="6F0D04E0">
+            <wp:extent cx="3954780" cy="2042078"/>
+            <wp:effectExtent l="0" t="0" r="7620" b="0"/>
+            <wp:docPr id="6" name="Рисунок 6"/>
+            <wp:cNvGraphicFramePr>
+              <a:graphicFrameLocks xmlns:a="http://schemas.openxmlformats.org/drawingml/2006/main" noChangeAspect="1"/>
+            </wp:cNvGraphicFramePr>
+            <a:graphic xmlns:a="http://schemas.openxmlformats.org/drawingml/2006/main">
+              <a:graphicData uri="http://schemas.openxmlformats.org/drawingml/2006/picture">
+                <pic:pic xmlns:pic="http://schemas.openxmlformats.org/drawingml/2006/picture">
+                  <pic:nvPicPr>
+                    <pic:cNvPr id="1" name=""/>
+                    <pic:cNvPicPr/>
+                  </pic:nvPicPr>
+                  <pic:blipFill>
+                    <a:blip r:embed="rId10"/>
+                    <a:stretch>
+                      <a:fillRect/>
+                    </a:stretch>
+                  </pic:blipFill>
+                  <pic:spPr>
+                    <a:xfrm>
+                      <a:off x="0" y="0"/>
+                      <a:ext cx="3965512" cy="2047620"/>
+                    </a:xfrm>
+                    <a:prstGeom prst="rect">
+                      <a:avLst/>
+                    </a:prstGeom>
+                  </pic:spPr>
+                </pic:pic>
+              </a:graphicData>
+            </a:graphic>
+          </wp:inline>
+        </w:drawing>
+      </w:r>
+    </w:p>
+    <w:p>
+      <w:pPr>
+        <w:pStyle w:val="Stand"/>
         <w:jc w:val="center"/>
         <w:rPr>
-          <w:b/>
-          <w:bCs/>
-          <w:sz w:val="32"/>
-          <w:szCs w:val="32"/>
-        </w:rPr>
-      </w:pPr>
-      <w:r>
-        <w:rPr>
-          <w:b/>
-          <w:bCs/>
-          <w:sz w:val="32"/>
-          <w:szCs w:val="32"/>
-        </w:rPr>
-        <w:lastRenderedPageBreak/>
-        <w:t>ЗАКЛЮЧЕНИЕ</w:t>
-      </w:r>
-    </w:p>
-    <w:p>
-      <w:pPr>
-        <w:pStyle w:val="Stand"/>
-      </w:pPr>
-    </w:p>
-    <w:p>
-      <w:pPr>
-        <w:pStyle w:val="Stand"/>
-      </w:pPr>
-      <w:r>
-        <w:t>В ходе выполнения данной лабораторной работы были изучены</w:t>
-      </w:r>
-      <w:r>
-        <w:t xml:space="preserve"> основы работы с </w:t>
-      </w:r>
-      <w:r>
-        <w:t>файлами</w:t>
-      </w:r>
-      <w:r>
-        <w:t xml:space="preserve"> в </w:t>
-      </w:r>
-      <w:r>
-        <w:t>процессор</w:t>
-      </w:r>
-      <w:r>
-        <w:t>е</w:t>
-      </w:r>
-      <w:r>
-        <w:t xml:space="preserve"> </w:t>
-      </w:r>
-      <w:r>
-        <w:rPr>
           <w:lang w:val="en-US"/>
         </w:rPr>
-        <w:t>Intel</w:t>
-      </w:r>
-      <w:r>
-        <w:t xml:space="preserve"> 8086</w:t>
-      </w:r>
-      <w:r>
-        <w:t>.</w:t>
-      </w:r>
-      <w:r>
-        <w:t xml:space="preserve"> </w:t>
-      </w:r>
-      <w:r>
-        <w:t xml:space="preserve">Были рассмотрены </w:t>
-      </w:r>
-      <w:r>
-        <w:t>прерывания</w:t>
-      </w:r>
-      <w:r>
-        <w:t xml:space="preserve"> для </w:t>
-      </w:r>
-      <w:r>
-        <w:t>освобождения места, занимаемого программой, а также для вызова других программ</w:t>
-      </w:r>
-      <w:r>
-        <w:t>.</w:t>
+      </w:pPr>
+    </w:p>
+    <w:p>
+      <w:pPr>
+        <w:pStyle w:val="Stand"/>
+        <w:jc w:val="center"/>
+      </w:pPr>
+      <w:r>
+        <w:t>Рисунок 3 –</w:t>
+      </w:r>
+      <w:r>
+        <w:t xml:space="preserve"> Коммит измененного файла</w:t>
       </w:r>
     </w:p>
     <w:sectPr>
-      <w:footerReference w:type="default" r:id="rId9"/>
-      <w:footerReference w:type="first" r:id="rId10"/>
+      <w:footerReference w:type="default" r:id="rId11"/>
+      <w:footerReference w:type="first" r:id="rId12"/>
       <w:pgSz w:w="11906" w:h="16838" w:code="9"/>
       <w:pgMar w:top="1134" w:right="851" w:bottom="1134" w:left="1701" w:header="709" w:footer="709" w:gutter="0"/>
       <w:cols w:space="708"/>
@@ -2833,7 +2547,6 @@
   <w:style w:type="character" w:default="1" w:styleId="a0">
     <w:name w:val="Default Paragraph Font"/>
     <w:uiPriority w:val="1"/>
-    <w:semiHidden/>
     <w:unhideWhenUsed/>
   </w:style>
   <w:style w:type="table" w:default="1" w:styleId="a1">

</xml_diff>